<commit_message>
add feature variabel tambahan
</commit_message>
<xml_diff>
--- a/public/templates/LAMPIRAN PML.docx
+++ b/public/templates/LAMPIRAN PML.docx
@@ -115,40 +115,7 @@
           <w:sz w:val="24"/>
           <w:szCs w:val="24"/>
         </w:rPr>
-        <w:fldChar w:fldCharType="begin"/>
-      </w:r>
-      <w:r>
-        <w:rPr>
-          <w:rFonts w:ascii="Bookman Old Style" w:eastAsia="Bookman Old Style" w:hAnsi="Bookman Old Style" w:cs="Bookman Old Style"/>
-          <w:sz w:val="24"/>
-          <w:szCs w:val="24"/>
-        </w:rPr>
-        <w:instrText xml:space="preserve"> MERGEFIELD Nomor_Kontrak </w:instrText>
-      </w:r>
-      <w:r>
-        <w:rPr>
-          <w:rFonts w:ascii="Bookman Old Style" w:eastAsia="Bookman Old Style" w:hAnsi="Bookman Old Style" w:cs="Bookman Old Style"/>
-          <w:sz w:val="24"/>
-          <w:szCs w:val="24"/>
-        </w:rPr>
-        <w:fldChar w:fldCharType="separate"/>
-      </w:r>
-      <w:r>
-        <w:rPr>
-          <w:rFonts w:ascii="Bookman Old Style" w:eastAsia="Bookman Old Style" w:hAnsi="Bookman Old Style" w:cs="Bookman Old Style"/>
-          <w:noProof/>
-          <w:sz w:val="24"/>
-          <w:szCs w:val="24"/>
-        </w:rPr>
-        <w:t>«Nomor_Kontrak»</w:t>
-      </w:r>
-      <w:r>
-        <w:rPr>
-          <w:rFonts w:ascii="Bookman Old Style" w:eastAsia="Bookman Old Style" w:hAnsi="Bookman Old Style" w:cs="Bookman Old Style"/>
-          <w:sz w:val="24"/>
-          <w:szCs w:val="24"/>
-        </w:rPr>
-        <w:fldChar w:fldCharType="end"/>
+        <w:t>{nomor_kontrak}</w:t>
       </w:r>
     </w:p>
     <w:p>
@@ -693,7 +660,7 @@
                 <w:sz w:val="24"/>
                 <w:szCs w:val="24"/>
               </w:rPr>
-              <w:fldChar w:fldCharType="begin"/>
+              <w:t>{</w:t>
             </w:r>
             <w:r>
               <w:rPr>
@@ -702,7 +669,7 @@
                 <w:sz w:val="24"/>
                 <w:szCs w:val="24"/>
               </w:rPr>
-              <w:instrText xml:space="preserve"> MERGEFIELD M_40_SLS </w:instrText>
+              <w:t>total_</w:t>
             </w:r>
             <w:r>
               <w:rPr>
@@ -711,35 +678,7 @@
                 <w:sz w:val="24"/>
                 <w:szCs w:val="24"/>
               </w:rPr>
-              <w:fldChar w:fldCharType="separate"/>
-            </w:r>
-            <w:r>
-              <w:rPr>
-                <w:rFonts w:ascii="Bookman Old Style" w:eastAsia="Bookman Old Style" w:hAnsi="Bookman Old Style" w:cs="Bookman Old Style"/>
-                <w:noProof/>
-                <w:color w:val="000000" w:themeColor="text1"/>
-                <w:sz w:val="24"/>
-                <w:szCs w:val="24"/>
-              </w:rPr>
-              <w:t>«M_40_SLS»</w:t>
-            </w:r>
-            <w:r>
-              <w:rPr>
-                <w:rFonts w:ascii="Bookman Old Style" w:eastAsia="Bookman Old Style" w:hAnsi="Bookman Old Style" w:cs="Bookman Old Style"/>
-                <w:color w:val="000000" w:themeColor="text1"/>
-                <w:sz w:val="24"/>
-                <w:szCs w:val="24"/>
-              </w:rPr>
-              <w:fldChar w:fldCharType="end"/>
-            </w:r>
-            <w:r>
-              <w:rPr>
-                <w:rFonts w:ascii="Bookman Old Style" w:eastAsia="Bookman Old Style" w:hAnsi="Bookman Old Style" w:cs="Bookman Old Style"/>
-                <w:color w:val="000000" w:themeColor="text1"/>
-                <w:sz w:val="24"/>
-                <w:szCs w:val="24"/>
-              </w:rPr>
-              <w:t xml:space="preserve"> SLS/Sub-SLS</w:t>
+              <w:t>jumlah_40}</w:t>
             </w:r>
           </w:p>
         </w:tc>
@@ -916,7 +855,7 @@
                 <w:sz w:val="24"/>
                 <w:szCs w:val="24"/>
               </w:rPr>
-              <w:fldChar w:fldCharType="begin"/>
+              <w:t>{</w:t>
             </w:r>
             <w:r>
               <w:rPr>
@@ -925,7 +864,7 @@
                 <w:sz w:val="24"/>
                 <w:szCs w:val="24"/>
               </w:rPr>
-              <w:instrText xml:space="preserve"> MERGEFIELD M_60_SLS </w:instrText>
+              <w:t>total_</w:t>
             </w:r>
             <w:r>
               <w:rPr>
@@ -934,35 +873,7 @@
                 <w:sz w:val="24"/>
                 <w:szCs w:val="24"/>
               </w:rPr>
-              <w:fldChar w:fldCharType="separate"/>
-            </w:r>
-            <w:r>
-              <w:rPr>
-                <w:rFonts w:ascii="Bookman Old Style" w:eastAsia="Bookman Old Style" w:hAnsi="Bookman Old Style" w:cs="Bookman Old Style"/>
-                <w:noProof/>
-                <w:color w:val="000000" w:themeColor="text1"/>
-                <w:sz w:val="24"/>
-                <w:szCs w:val="24"/>
-              </w:rPr>
-              <w:t>«M_60_SLS»</w:t>
-            </w:r>
-            <w:r>
-              <w:rPr>
-                <w:rFonts w:ascii="Bookman Old Style" w:eastAsia="Bookman Old Style" w:hAnsi="Bookman Old Style" w:cs="Bookman Old Style"/>
-                <w:color w:val="000000" w:themeColor="text1"/>
-                <w:sz w:val="24"/>
-                <w:szCs w:val="24"/>
-              </w:rPr>
-              <w:fldChar w:fldCharType="end"/>
-            </w:r>
-            <w:r>
-              <w:rPr>
-                <w:rFonts w:ascii="Bookman Old Style" w:eastAsia="Bookman Old Style" w:hAnsi="Bookman Old Style" w:cs="Bookman Old Style"/>
-                <w:color w:val="000000" w:themeColor="text1"/>
-                <w:sz w:val="24"/>
-                <w:szCs w:val="24"/>
-              </w:rPr>
-              <w:t xml:space="preserve"> SLS/Sub-SLS</w:t>
+              <w:t>jumlah_60}</w:t>
             </w:r>
           </w:p>
         </w:tc>

</xml_diff>